<commit_message>
v27 - Business Central source
</commit_message>
<xml_diff>
--- a/applications/BaseApp/Source/Base Application.Source/Purchases/Document/StandardPurchaseOrderThemable.docx
+++ b/applications/BaseApp/Source/Base Application.Source/Purchases/Document/StandardPurchaseOrderThemable.docx
@@ -1,18 +1,18 @@
 
 <file path=word/document.xml><?xml version="1.0" encoding="utf-8"?>
-<w:document xmlns:wpc="http://schemas.microsoft.com/office/word/2010/wordprocessingCanvas" xmlns:cx="http://schemas.microsoft.com/office/drawing/2014/chartex" xmlns:cx1="http://schemas.microsoft.com/office/drawing/2015/9/8/chartex" xmlns:cx2="http://schemas.microsoft.com/office/drawing/2015/10/21/chartex" xmlns:cx3="http://schemas.microsoft.com/office/drawing/2016/5/9/chartex" xmlns:cx4="http://schemas.microsoft.com/office/drawing/2016/5/10/chartex" xmlns:cx5="http://schemas.microsoft.com/office/drawing/2016/5/11/chartex" xmlns:cx6="http://schemas.microsoft.com/office/drawing/2016/5/12/chartex" xmlns:cx7="http://schemas.microsoft.com/office/drawing/2016/5/13/chartex" xmlns:cx8="http://schemas.microsoft.com/office/drawing/2016/5/14/chartex" xmlns:mc="http://schemas.openxmlformats.org/markup-compatibility/2006" xmlns:aink="http://schemas.microsoft.com/office/drawing/2016/ink" xmlns:am3d="http://schemas.microsoft.com/office/drawing/2017/model3d" xmlns:o="urn:schemas-microsoft-com:office:office" xmlns:oel="http://schemas.microsoft.com/office/2019/extlst" xmlns:r="http://schemas.openxmlformats.org/officeDocument/2006/relationships" xmlns:m="http://schemas.openxmlformats.org/officeDocument/2006/math" xmlns:v="urn:schemas-microsoft-com:vml" xmlns:wp14="http://schemas.microsoft.com/office/word/2010/wordprocessingDrawing" xmlns:wp="http://schemas.openxmlformats.org/drawingml/2006/wordprocessingDrawing" xmlns:w10="urn:schemas-microsoft-com:office:word" xmlns:w="http://schemas.openxmlformats.org/wordprocessingml/2006/main" xmlns:w14="http://schemas.microsoft.com/office/word/2010/wordml" xmlns:w15="http://schemas.microsoft.com/office/word/2012/wordml" xmlns:w16cex="http://schemas.microsoft.com/office/word/2018/wordml/cex" xmlns:w16cid="http://schemas.microsoft.com/office/word/2016/wordml/cid" xmlns:w16="http://schemas.microsoft.com/office/word/2018/wordml" xmlns:w16sdtdh="http://schemas.microsoft.com/office/word/2020/wordml/sdtdatahash" xmlns:w16se="http://schemas.microsoft.com/office/word/2015/wordml/symex" xmlns:wpg="http://schemas.microsoft.com/office/word/2010/wordprocessingGroup" xmlns:wpi="http://schemas.microsoft.com/office/word/2010/wordprocessingInk" xmlns:wne="http://schemas.microsoft.com/office/word/2006/wordml" xmlns:wps="http://schemas.microsoft.com/office/word/2010/wordprocessingShape" mc:Ignorable="w14 w15 w16se w16cid w16 w16cex w16sdtdh wp14">
+<w:document xmlns:wpc="http://schemas.microsoft.com/office/word/2010/wordprocessingCanvas" xmlns:cx="http://schemas.microsoft.com/office/drawing/2014/chartex" xmlns:cx1="http://schemas.microsoft.com/office/drawing/2015/9/8/chartex" xmlns:cx2="http://schemas.microsoft.com/office/drawing/2015/10/21/chartex" xmlns:cx3="http://schemas.microsoft.com/office/drawing/2016/5/9/chartex" xmlns:cx4="http://schemas.microsoft.com/office/drawing/2016/5/10/chartex" xmlns:cx5="http://schemas.microsoft.com/office/drawing/2016/5/11/chartex" xmlns:cx6="http://schemas.microsoft.com/office/drawing/2016/5/12/chartex" xmlns:cx7="http://schemas.microsoft.com/office/drawing/2016/5/13/chartex" xmlns:cx8="http://schemas.microsoft.com/office/drawing/2016/5/14/chartex" xmlns:mc="http://schemas.openxmlformats.org/markup-compatibility/2006" xmlns:aink="http://schemas.microsoft.com/office/drawing/2016/ink" xmlns:am3d="http://schemas.microsoft.com/office/drawing/2017/model3d" xmlns:o="urn:schemas-microsoft-com:office:office" xmlns:oel="http://schemas.microsoft.com/office/2019/extlst" xmlns:r="http://schemas.openxmlformats.org/officeDocument/2006/relationships" xmlns:m="http://schemas.openxmlformats.org/officeDocument/2006/math" xmlns:v="urn:schemas-microsoft-com:vml" xmlns:wp14="http://schemas.microsoft.com/office/word/2010/wordprocessingDrawing" xmlns:wp="http://schemas.openxmlformats.org/drawingml/2006/wordprocessingDrawing" xmlns:w10="urn:schemas-microsoft-com:office:word" xmlns:w="http://schemas.openxmlformats.org/wordprocessingml/2006/main" xmlns:w14="http://schemas.microsoft.com/office/word/2010/wordml" xmlns:w15="http://schemas.microsoft.com/office/word/2012/wordml" xmlns:w16cex="http://schemas.microsoft.com/office/word/2018/wordml/cex" xmlns:w16cid="http://schemas.microsoft.com/office/word/2016/wordml/cid" xmlns:w16="http://schemas.microsoft.com/office/word/2018/wordml" xmlns:w16du="http://schemas.microsoft.com/office/word/2023/wordml/word16du" xmlns:w16sdtdh="http://schemas.microsoft.com/office/word/2020/wordml/sdtdatahash" xmlns:w16sdtfl="http://schemas.microsoft.com/office/word/2024/wordml/sdtformatlock" xmlns:w16se="http://schemas.microsoft.com/office/word/2015/wordml/symex" xmlns:wpg="http://schemas.microsoft.com/office/word/2010/wordprocessingGroup" xmlns:wpi="http://schemas.microsoft.com/office/word/2010/wordprocessingInk" xmlns:wne="http://schemas.microsoft.com/office/word/2006/wordml" xmlns:wps="http://schemas.microsoft.com/office/word/2010/wordprocessingShape" mc:Ignorable="w14 w15 w16se w16cid w16 w16cex w16sdtdh w16sdtfl w16du wp14">
   <w:body>
     <w:tbl>
       <w:tblPr>
         <w:tblStyle w:val="TableGrid"/>
         <w:tblW w:w="0" w:type="auto"/>
         <w:tblBorders>
-          <w:top w:val="none" w:color="auto" w:sz="0" w:space="0"/>
-          <w:left w:val="none" w:color="auto" w:sz="0" w:space="0"/>
-          <w:bottom w:val="none" w:color="auto" w:sz="0" w:space="0"/>
-          <w:right w:val="none" w:color="auto" w:sz="0" w:space="0"/>
-          <w:insideH w:val="none" w:color="auto" w:sz="0" w:space="0"/>
-          <w:insideV w:val="none" w:color="auto" w:sz="0" w:space="0"/>
+          <w:top w:val="none" w:sz="0" w:space="0" w:color="auto"/>
+          <w:left w:val="none" w:sz="0" w:space="0" w:color="auto"/>
+          <w:bottom w:val="none" w:sz="0" w:space="0" w:color="auto"/>
+          <w:right w:val="none" w:sz="0" w:space="0" w:color="auto"/>
+          <w:insideH w:val="none" w:sz="0" w:space="0" w:color="auto"/>
+          <w:insideV w:val="none" w:sz="0" w:space="0" w:color="auto"/>
         </w:tblBorders>
         <w:tblLayout w:type="fixed"/>
         <w:tblLook w:val="04A0" w:firstRow="1" w:lastRow="0" w:firstColumn="1" w:lastColumn="0" w:noHBand="0" w:noVBand="1"/>
@@ -826,12 +826,12 @@
         <w:tblStyle w:val="TableGrid"/>
         <w:tblW w:w="0" w:type="auto"/>
         <w:tblBorders>
-          <w:top w:val="none" w:color="auto" w:sz="0" w:space="0"/>
-          <w:left w:val="none" w:color="auto" w:sz="0" w:space="0"/>
-          <w:bottom w:val="none" w:color="auto" w:sz="0" w:space="0"/>
-          <w:right w:val="none" w:color="auto" w:sz="0" w:space="0"/>
-          <w:insideH w:val="none" w:color="auto" w:sz="0" w:space="0"/>
-          <w:insideV w:val="none" w:color="auto" w:sz="0" w:space="0"/>
+          <w:top w:val="none" w:sz="0" w:space="0" w:color="auto"/>
+          <w:left w:val="none" w:sz="0" w:space="0" w:color="auto"/>
+          <w:bottom w:val="none" w:sz="0" w:space="0" w:color="auto"/>
+          <w:right w:val="none" w:sz="0" w:space="0" w:color="auto"/>
+          <w:insideH w:val="none" w:sz="0" w:space="0" w:color="auto"/>
+          <w:insideV w:val="none" w:sz="0" w:space="0" w:color="auto"/>
         </w:tblBorders>
         <w:tblLayout w:type="fixed"/>
         <w:tblLook w:val="04A0" w:firstRow="1" w:lastRow="0" w:firstColumn="1" w:lastColumn="0" w:noHBand="0" w:noVBand="1"/>
@@ -1307,12 +1307,12 @@
         <w:tblStyle w:val="TableGrid"/>
         <w:tblW w:w="0" w:type="auto"/>
         <w:tblBorders>
-          <w:top w:val="none" w:color="auto" w:sz="0" w:space="0"/>
-          <w:left w:val="none" w:color="auto" w:sz="0" w:space="0"/>
-          <w:bottom w:val="none" w:color="auto" w:sz="0" w:space="0"/>
-          <w:right w:val="none" w:color="auto" w:sz="0" w:space="0"/>
-          <w:insideH w:val="none" w:color="auto" w:sz="0" w:space="0"/>
-          <w:insideV w:val="none" w:color="auto" w:sz="0" w:space="0"/>
+          <w:top w:val="none" w:sz="0" w:space="0" w:color="auto"/>
+          <w:left w:val="none" w:sz="0" w:space="0" w:color="auto"/>
+          <w:bottom w:val="none" w:sz="0" w:space="0" w:color="auto"/>
+          <w:right w:val="none" w:sz="0" w:space="0" w:color="auto"/>
+          <w:insideH w:val="none" w:sz="0" w:space="0" w:color="auto"/>
+          <w:insideV w:val="none" w:sz="0" w:space="0" w:color="auto"/>
         </w:tblBorders>
         <w:tblLayout w:type="fixed"/>
         <w:tblLook w:val="04A0" w:firstRow="1" w:lastRow="0" w:firstColumn="1" w:lastColumn="0" w:noHBand="0" w:noVBand="1"/>
@@ -1459,12 +1459,12 @@
         <w:tblStyle w:val="TableGrid"/>
         <w:tblW w:w="10225" w:type="dxa"/>
         <w:tblBorders>
-          <w:top w:val="none" w:color="auto" w:sz="0" w:space="0"/>
-          <w:left w:val="none" w:color="auto" w:sz="0" w:space="0"/>
-          <w:bottom w:val="none" w:color="auto" w:sz="0" w:space="0"/>
-          <w:right w:val="none" w:color="auto" w:sz="0" w:space="0"/>
-          <w:insideH w:val="none" w:color="auto" w:sz="0" w:space="0"/>
-          <w:insideV w:val="none" w:color="auto" w:sz="0" w:space="0"/>
+          <w:top w:val="none" w:sz="0" w:space="0" w:color="auto"/>
+          <w:left w:val="none" w:sz="0" w:space="0" w:color="auto"/>
+          <w:bottom w:val="none" w:sz="0" w:space="0" w:color="auto"/>
+          <w:right w:val="none" w:sz="0" w:space="0" w:color="auto"/>
+          <w:insideH w:val="none" w:sz="0" w:space="0" w:color="auto"/>
+          <w:insideV w:val="none" w:sz="0" w:space="0" w:color="auto"/>
         </w:tblBorders>
         <w:tblLayout w:type="fixed"/>
         <w:tblLook w:val="04A0" w:firstRow="1" w:lastRow="0" w:firstColumn="1" w:lastColumn="0" w:noHBand="0" w:noVBand="1"/>
@@ -1498,7 +1498,7 @@
               <w:tcPr>
                 <w:tcW w:w="994" w:type="dxa"/>
                 <w:tcBorders>
-                  <w:bottom w:val="single" w:color="auto" w:sz="4" w:space="0"/>
+                  <w:bottom w:val="single" w:sz="4" w:space="0" w:color="auto"/>
                 </w:tcBorders>
                 <w:shd w:val="clear" w:color="auto" w:fill="5B9BD5" w:themeFill="accent1"/>
                 <w:vAlign w:val="bottom"/>
@@ -1532,7 +1532,7 @@
               <w:tcPr>
                 <w:tcW w:w="3139" w:type="dxa"/>
                 <w:tcBorders>
-                  <w:bottom w:val="single" w:color="auto" w:sz="4" w:space="0"/>
+                  <w:bottom w:val="single" w:sz="4" w:space="0" w:color="auto"/>
                 </w:tcBorders>
                 <w:shd w:val="clear" w:color="auto" w:fill="5B9BD5" w:themeFill="accent1"/>
                 <w:vAlign w:val="bottom"/>
@@ -1566,7 +1566,7 @@
               <w:tcPr>
                 <w:tcW w:w="1080" w:type="dxa"/>
                 <w:tcBorders>
-                  <w:bottom w:val="single" w:color="auto" w:sz="4" w:space="0"/>
+                  <w:bottom w:val="single" w:sz="4" w:space="0" w:color="auto"/>
                 </w:tcBorders>
                 <w:shd w:val="clear" w:color="auto" w:fill="5B9BD5" w:themeFill="accent1"/>
                 <w:vAlign w:val="bottom"/>
@@ -1601,7 +1601,7 @@
               <w:tcPr>
                 <w:tcW w:w="994" w:type="dxa"/>
                 <w:tcBorders>
-                  <w:bottom w:val="single" w:color="auto" w:sz="4" w:space="0"/>
+                  <w:bottom w:val="single" w:sz="4" w:space="0" w:color="auto"/>
                 </w:tcBorders>
                 <w:shd w:val="clear" w:color="auto" w:fill="5B9BD5" w:themeFill="accent1"/>
                 <w:vAlign w:val="bottom"/>
@@ -1635,7 +1635,7 @@
               <w:tcPr>
                 <w:tcW w:w="1282" w:type="dxa"/>
                 <w:tcBorders>
-                  <w:bottom w:val="single" w:color="auto" w:sz="4" w:space="0"/>
+                  <w:bottom w:val="single" w:sz="4" w:space="0" w:color="auto"/>
                 </w:tcBorders>
                 <w:shd w:val="clear" w:color="auto" w:fill="5B9BD5" w:themeFill="accent1"/>
                 <w:vAlign w:val="bottom"/>
@@ -1670,7 +1670,7 @@
               <w:tcPr>
                 <w:tcW w:w="1368" w:type="dxa"/>
                 <w:tcBorders>
-                  <w:bottom w:val="single" w:color="auto" w:sz="4" w:space="0"/>
+                  <w:bottom w:val="single" w:sz="4" w:space="0" w:color="auto"/>
                 </w:tcBorders>
                 <w:shd w:val="clear" w:color="auto" w:fill="5B9BD5" w:themeFill="accent1"/>
                 <w:vAlign w:val="bottom"/>
@@ -1705,7 +1705,7 @@
               <w:tcPr>
                 <w:tcW w:w="1368" w:type="dxa"/>
                 <w:tcBorders>
-                  <w:bottom w:val="single" w:color="auto" w:sz="4" w:space="0"/>
+                  <w:bottom w:val="single" w:sz="4" w:space="0" w:color="auto"/>
                 </w:tcBorders>
                 <w:shd w:val="clear" w:color="auto" w:fill="5B9BD5" w:themeFill="accent1"/>
                 <w:vAlign w:val="bottom"/>
@@ -1727,13 +1727,13 @@
       </w:tr>
       <w:tr>
         <w:trPr>
-          <w:trHeight w:val="144" w:hRule="exact"/>
+          <w:trHeight w:hRule="exact" w:val="144"/>
         </w:trPr>
         <w:tc>
           <w:tcPr>
             <w:tcW w:w="994" w:type="dxa"/>
             <w:tcBorders>
-              <w:top w:val="single" w:color="auto" w:sz="4" w:space="0"/>
+              <w:top w:val="single" w:sz="4" w:space="0" w:color="auto"/>
             </w:tcBorders>
             <w:vAlign w:val="bottom"/>
           </w:tcPr>
@@ -1747,7 +1747,7 @@
           <w:tcPr>
             <w:tcW w:w="3139" w:type="dxa"/>
             <w:tcBorders>
-              <w:top w:val="single" w:color="auto" w:sz="4" w:space="0"/>
+              <w:top w:val="single" w:sz="4" w:space="0" w:color="auto"/>
             </w:tcBorders>
             <w:vAlign w:val="bottom"/>
           </w:tcPr>
@@ -1761,7 +1761,7 @@
           <w:tcPr>
             <w:tcW w:w="1080" w:type="dxa"/>
             <w:tcBorders>
-              <w:top w:val="single" w:color="auto" w:sz="4" w:space="0"/>
+              <w:top w:val="single" w:sz="4" w:space="0" w:color="auto"/>
             </w:tcBorders>
             <w:vAlign w:val="bottom"/>
           </w:tcPr>
@@ -1776,7 +1776,7 @@
           <w:tcPr>
             <w:tcW w:w="994" w:type="dxa"/>
             <w:tcBorders>
-              <w:top w:val="single" w:color="auto" w:sz="4" w:space="0"/>
+              <w:top w:val="single" w:sz="4" w:space="0" w:color="auto"/>
             </w:tcBorders>
             <w:vAlign w:val="bottom"/>
           </w:tcPr>
@@ -1790,7 +1790,7 @@
           <w:tcPr>
             <w:tcW w:w="1282" w:type="dxa"/>
             <w:tcBorders>
-              <w:top w:val="single" w:color="auto" w:sz="4" w:space="0"/>
+              <w:top w:val="single" w:sz="4" w:space="0" w:color="auto"/>
             </w:tcBorders>
             <w:vAlign w:val="bottom"/>
           </w:tcPr>
@@ -1805,7 +1805,7 @@
           <w:tcPr>
             <w:tcW w:w="1368" w:type="dxa"/>
             <w:tcBorders>
-              <w:top w:val="single" w:color="auto" w:sz="4" w:space="0"/>
+              <w:top w:val="single" w:sz="4" w:space="0" w:color="auto"/>
             </w:tcBorders>
             <w:vAlign w:val="bottom"/>
           </w:tcPr>
@@ -1820,7 +1820,7 @@
           <w:tcPr>
             <w:tcW w:w="1368" w:type="dxa"/>
             <w:tcBorders>
-              <w:top w:val="single" w:color="auto" w:sz="4" w:space="0"/>
+              <w:top w:val="single" w:sz="4" w:space="0" w:color="auto"/>
             </w:tcBorders>
             <w:vAlign w:val="bottom"/>
           </w:tcPr>
@@ -1841,7 +1841,7 @@
           <w:alias w:val="#Nav: /Purchase_Header/Purchase_Line"/>
           <w:tag w:val="#Nav: Standard_Purchase_Order/1322"/>
           <w:id w:val="1326716514"/>
-          <w15:dataBinding w:prefixMappings="xmlns:ns0='urn:microsoft-dynamics-nav/reports/Standard_Purchase_Order/1322/'" w:xpath="/ns0:NavWordReportXmlPart[1]/ns0:Purchase_Header[1]/ns0:Purchase_Line" w:storeItemID="{7C9D7B99-3F0A-4DC8-9D28-B3E523DBEA5C}"/>
+          <w15:dataBinding w:prefixMappings="xmlns:ns0='urn:microsoft-dynamics-nav/reports/Standard_Purchase_Order/1322/' " w:xpath="/ns0:NavWordReportXmlPart[1]/ns0:Purchase_Header[1]/ns0:Purchase_Line" w:storeItemID="{7C9D7B99-3F0A-4DC8-9D28-B3E523DBEA5C}"/>
           <w15:repeatingSection/>
         </w:sdtPr>
         <w:sdtContent>
@@ -1964,6 +1964,7 @@
                       </w:tcPr>
                       <w:p>
                         <w:pPr>
+                          <w:jc w:val="right"/>
                           <w:rPr>
                             <w:sz w:val="20"/>
                             <w:szCs w:val="20"/>
@@ -2044,6 +2045,7 @@
                       </w:tcPr>
                       <w:p>
                         <w:pPr>
+                          <w:jc w:val="right"/>
                           <w:rPr>
                             <w:sz w:val="20"/>
                             <w:szCs w:val="20"/>
@@ -2124,6 +2126,7 @@
                       </w:tcPr>
                       <w:p>
                         <w:pPr>
+                          <w:jc w:val="right"/>
                           <w:rPr>
                             <w:sz w:val="20"/>
                             <w:szCs w:val="20"/>
@@ -2149,7 +2152,7 @@
       </w:sdt>
       <w:tr>
         <w:trPr>
-          <w:trHeight w:val="144" w:hRule="exact"/>
+          <w:trHeight w:hRule="exact" w:val="144"/>
         </w:trPr>
         <w:tc>
           <w:tcPr>
@@ -2205,7 +2208,7 @@
           <w:tcPr>
             <w:tcW w:w="1368" w:type="dxa"/>
             <w:tcBorders>
-              <w:bottom w:val="single" w:color="5B9BD5" w:themeColor="accent1" w:sz="4" w:space="0"/>
+              <w:bottom w:val="single" w:sz="4" w:space="0" w:color="5B9BD5" w:themeColor="accent1"/>
             </w:tcBorders>
           </w:tcPr>
           <w:p>
@@ -2218,7 +2221,7 @@
           <w:tcPr>
             <w:tcW w:w="1368" w:type="dxa"/>
             <w:tcBorders>
-              <w:bottom w:val="single" w:color="5B9BD5" w:themeColor="accent1" w:sz="4" w:space="0"/>
+              <w:bottom w:val="single" w:sz="4" w:space="0" w:color="5B9BD5" w:themeColor="accent1"/>
             </w:tcBorders>
           </w:tcPr>
           <w:p>
@@ -2331,7 +2334,7 @@
               <w:tcPr>
                 <w:tcW w:w="1368" w:type="dxa"/>
                 <w:tcBorders>
-                  <w:top w:val="single" w:color="5B9BD5" w:themeColor="accent1" w:sz="4" w:space="0"/>
+                  <w:top w:val="single" w:sz="4" w:space="0" w:color="5B9BD5" w:themeColor="accent1"/>
                 </w:tcBorders>
               </w:tcPr>
               <w:p>
@@ -2436,7 +2439,7 @@
               <w:tcPr>
                 <w:tcW w:w="1368" w:type="dxa"/>
                 <w:tcBorders>
-                  <w:bottom w:val="single" w:color="5B9BD5" w:themeColor="accent1" w:sz="4" w:space="0"/>
+                  <w:bottom w:val="single" w:sz="4" w:space="0" w:color="5B9BD5" w:themeColor="accent1"/>
                 </w:tcBorders>
               </w:tcPr>
               <w:p>
@@ -2468,7 +2471,7 @@
               <w:tcPr>
                 <w:tcW w:w="1368" w:type="dxa"/>
                 <w:tcBorders>
-                  <w:bottom w:val="single" w:color="5B9BD5" w:themeColor="accent1" w:sz="4" w:space="0"/>
+                  <w:bottom w:val="single" w:sz="4" w:space="0" w:color="5B9BD5" w:themeColor="accent1"/>
                 </w:tcBorders>
               </w:tcPr>
               <w:p>
@@ -2600,7 +2603,7 @@
               <w:tcPr>
                 <w:tcW w:w="1368" w:type="dxa"/>
                 <w:tcBorders>
-                  <w:top w:val="single" w:color="5B9BD5" w:themeColor="accent1" w:sz="4" w:space="0"/>
+                  <w:top w:val="single" w:sz="4" w:space="0" w:color="5B9BD5" w:themeColor="accent1"/>
                 </w:tcBorders>
               </w:tcPr>
               <w:p>
@@ -2653,7 +2656,7 @@
 </file>
 
 <file path=word/endnotes.xml><?xml version="1.0" encoding="utf-8"?>
-<w:endnotes xmlns:wpc="http://schemas.microsoft.com/office/word/2010/wordprocessingCanvas" xmlns:cx="http://schemas.microsoft.com/office/drawing/2014/chartex" xmlns:cx1="http://schemas.microsoft.com/office/drawing/2015/9/8/chartex" xmlns:cx2="http://schemas.microsoft.com/office/drawing/2015/10/21/chartex" xmlns:cx3="http://schemas.microsoft.com/office/drawing/2016/5/9/chartex" xmlns:cx4="http://schemas.microsoft.com/office/drawing/2016/5/10/chartex" xmlns:cx5="http://schemas.microsoft.com/office/drawing/2016/5/11/chartex" xmlns:cx6="http://schemas.microsoft.com/office/drawing/2016/5/12/chartex" xmlns:cx7="http://schemas.microsoft.com/office/drawing/2016/5/13/chartex" xmlns:cx8="http://schemas.microsoft.com/office/drawing/2016/5/14/chartex" xmlns:mc="http://schemas.openxmlformats.org/markup-compatibility/2006" xmlns:aink="http://schemas.microsoft.com/office/drawing/2016/ink" xmlns:am3d="http://schemas.microsoft.com/office/drawing/2017/model3d" xmlns:o="urn:schemas-microsoft-com:office:office" xmlns:oel="http://schemas.microsoft.com/office/2019/extlst" xmlns:r="http://schemas.openxmlformats.org/officeDocument/2006/relationships" xmlns:m="http://schemas.openxmlformats.org/officeDocument/2006/math" xmlns:v="urn:schemas-microsoft-com:vml" xmlns:wp14="http://schemas.microsoft.com/office/word/2010/wordprocessingDrawing" xmlns:wp="http://schemas.openxmlformats.org/drawingml/2006/wordprocessingDrawing" xmlns:w10="urn:schemas-microsoft-com:office:word" xmlns:w="http://schemas.openxmlformats.org/wordprocessingml/2006/main" xmlns:w14="http://schemas.microsoft.com/office/word/2010/wordml" xmlns:w15="http://schemas.microsoft.com/office/word/2012/wordml" xmlns:w16cex="http://schemas.microsoft.com/office/word/2018/wordml/cex" xmlns:w16cid="http://schemas.microsoft.com/office/word/2016/wordml/cid" xmlns:w16="http://schemas.microsoft.com/office/word/2018/wordml" xmlns:w16sdtdh="http://schemas.microsoft.com/office/word/2020/wordml/sdtdatahash" xmlns:w16se="http://schemas.microsoft.com/office/word/2015/wordml/symex" xmlns:wpg="http://schemas.microsoft.com/office/word/2010/wordprocessingGroup" xmlns:wpi="http://schemas.microsoft.com/office/word/2010/wordprocessingInk" xmlns:wne="http://schemas.microsoft.com/office/word/2006/wordml" xmlns:wps="http://schemas.microsoft.com/office/word/2010/wordprocessingShape" mc:Ignorable="w14 w15 w16se w16cid w16 w16cex w16sdtdh wp14">
+<w:endnotes xmlns:wpc="http://schemas.microsoft.com/office/word/2010/wordprocessingCanvas" xmlns:cx="http://schemas.microsoft.com/office/drawing/2014/chartex" xmlns:cx1="http://schemas.microsoft.com/office/drawing/2015/9/8/chartex" xmlns:cx2="http://schemas.microsoft.com/office/drawing/2015/10/21/chartex" xmlns:cx3="http://schemas.microsoft.com/office/drawing/2016/5/9/chartex" xmlns:cx4="http://schemas.microsoft.com/office/drawing/2016/5/10/chartex" xmlns:cx5="http://schemas.microsoft.com/office/drawing/2016/5/11/chartex" xmlns:cx6="http://schemas.microsoft.com/office/drawing/2016/5/12/chartex" xmlns:cx7="http://schemas.microsoft.com/office/drawing/2016/5/13/chartex" xmlns:cx8="http://schemas.microsoft.com/office/drawing/2016/5/14/chartex" xmlns:mc="http://schemas.openxmlformats.org/markup-compatibility/2006" xmlns:aink="http://schemas.microsoft.com/office/drawing/2016/ink" xmlns:am3d="http://schemas.microsoft.com/office/drawing/2017/model3d" xmlns:o="urn:schemas-microsoft-com:office:office" xmlns:oel="http://schemas.microsoft.com/office/2019/extlst" xmlns:r="http://schemas.openxmlformats.org/officeDocument/2006/relationships" xmlns:m="http://schemas.openxmlformats.org/officeDocument/2006/math" xmlns:v="urn:schemas-microsoft-com:vml" xmlns:wp14="http://schemas.microsoft.com/office/word/2010/wordprocessingDrawing" xmlns:wp="http://schemas.openxmlformats.org/drawingml/2006/wordprocessingDrawing" xmlns:w10="urn:schemas-microsoft-com:office:word" xmlns:w="http://schemas.openxmlformats.org/wordprocessingml/2006/main" xmlns:w14="http://schemas.microsoft.com/office/word/2010/wordml" xmlns:w15="http://schemas.microsoft.com/office/word/2012/wordml" xmlns:w16cex="http://schemas.microsoft.com/office/word/2018/wordml/cex" xmlns:w16cid="http://schemas.microsoft.com/office/word/2016/wordml/cid" xmlns:w16="http://schemas.microsoft.com/office/word/2018/wordml" xmlns:w16du="http://schemas.microsoft.com/office/word/2023/wordml/word16du" xmlns:w16sdtdh="http://schemas.microsoft.com/office/word/2020/wordml/sdtdatahash" xmlns:w16sdtfl="http://schemas.microsoft.com/office/word/2024/wordml/sdtformatlock" xmlns:w16se="http://schemas.microsoft.com/office/word/2015/wordml/symex" xmlns:wpg="http://schemas.microsoft.com/office/word/2010/wordprocessingGroup" xmlns:wpi="http://schemas.microsoft.com/office/word/2010/wordprocessingInk" xmlns:wne="http://schemas.microsoft.com/office/word/2006/wordml" xmlns:wps="http://schemas.microsoft.com/office/word/2010/wordprocessingShape" mc:Ignorable="w14 w15 w16se w16cid w16 w16cex w16sdtdh w16sdtfl w16du wp14">
   <w:endnote w:type="separator" w:id="-1">
     <w:p>
       <w:pPr>
@@ -2678,19 +2681,19 @@
 </file>
 
 <file path=word/footer1.xml><?xml version="1.0" encoding="utf-8"?>
-<w:ftr xmlns:wpc="http://schemas.microsoft.com/office/word/2010/wordprocessingCanvas" xmlns:cx="http://schemas.microsoft.com/office/drawing/2014/chartex" xmlns:cx1="http://schemas.microsoft.com/office/drawing/2015/9/8/chartex" xmlns:cx2="http://schemas.microsoft.com/office/drawing/2015/10/21/chartex" xmlns:cx3="http://schemas.microsoft.com/office/drawing/2016/5/9/chartex" xmlns:cx4="http://schemas.microsoft.com/office/drawing/2016/5/10/chartex" xmlns:cx5="http://schemas.microsoft.com/office/drawing/2016/5/11/chartex" xmlns:cx6="http://schemas.microsoft.com/office/drawing/2016/5/12/chartex" xmlns:cx7="http://schemas.microsoft.com/office/drawing/2016/5/13/chartex" xmlns:cx8="http://schemas.microsoft.com/office/drawing/2016/5/14/chartex" xmlns:mc="http://schemas.openxmlformats.org/markup-compatibility/2006" xmlns:aink="http://schemas.microsoft.com/office/drawing/2016/ink" xmlns:am3d="http://schemas.microsoft.com/office/drawing/2017/model3d" xmlns:o="urn:schemas-microsoft-com:office:office" xmlns:oel="http://schemas.microsoft.com/office/2019/extlst" xmlns:r="http://schemas.openxmlformats.org/officeDocument/2006/relationships" xmlns:m="http://schemas.openxmlformats.org/officeDocument/2006/math" xmlns:v="urn:schemas-microsoft-com:vml" xmlns:wp14="http://schemas.microsoft.com/office/word/2010/wordprocessingDrawing" xmlns:wp="http://schemas.openxmlformats.org/drawingml/2006/wordprocessingDrawing" xmlns:w10="urn:schemas-microsoft-com:office:word" xmlns:w="http://schemas.openxmlformats.org/wordprocessingml/2006/main" xmlns:w14="http://schemas.microsoft.com/office/word/2010/wordml" xmlns:w15="http://schemas.microsoft.com/office/word/2012/wordml" xmlns:w16cex="http://schemas.microsoft.com/office/word/2018/wordml/cex" xmlns:w16cid="http://schemas.microsoft.com/office/word/2016/wordml/cid" xmlns:w16="http://schemas.microsoft.com/office/word/2018/wordml" xmlns:w16sdtdh="http://schemas.microsoft.com/office/word/2020/wordml/sdtdatahash" xmlns:w16se="http://schemas.microsoft.com/office/word/2015/wordml/symex" xmlns:wpg="http://schemas.microsoft.com/office/word/2010/wordprocessingGroup" xmlns:wpi="http://schemas.microsoft.com/office/word/2010/wordprocessingInk" xmlns:wne="http://schemas.microsoft.com/office/word/2006/wordml" xmlns:wps="http://schemas.microsoft.com/office/word/2010/wordprocessingShape" mc:Ignorable="w14 w15 w16se w16cid w16 w16cex w16sdtdh wp14">
+<w:ftr xmlns:wpc="http://schemas.microsoft.com/office/word/2010/wordprocessingCanvas" xmlns:cx="http://schemas.microsoft.com/office/drawing/2014/chartex" xmlns:cx1="http://schemas.microsoft.com/office/drawing/2015/9/8/chartex" xmlns:cx2="http://schemas.microsoft.com/office/drawing/2015/10/21/chartex" xmlns:cx3="http://schemas.microsoft.com/office/drawing/2016/5/9/chartex" xmlns:cx4="http://schemas.microsoft.com/office/drawing/2016/5/10/chartex" xmlns:cx5="http://schemas.microsoft.com/office/drawing/2016/5/11/chartex" xmlns:cx6="http://schemas.microsoft.com/office/drawing/2016/5/12/chartex" xmlns:cx7="http://schemas.microsoft.com/office/drawing/2016/5/13/chartex" xmlns:cx8="http://schemas.microsoft.com/office/drawing/2016/5/14/chartex" xmlns:mc="http://schemas.openxmlformats.org/markup-compatibility/2006" xmlns:aink="http://schemas.microsoft.com/office/drawing/2016/ink" xmlns:am3d="http://schemas.microsoft.com/office/drawing/2017/model3d" xmlns:o="urn:schemas-microsoft-com:office:office" xmlns:oel="http://schemas.microsoft.com/office/2019/extlst" xmlns:r="http://schemas.openxmlformats.org/officeDocument/2006/relationships" xmlns:m="http://schemas.openxmlformats.org/officeDocument/2006/math" xmlns:v="urn:schemas-microsoft-com:vml" xmlns:wp14="http://schemas.microsoft.com/office/word/2010/wordprocessingDrawing" xmlns:wp="http://schemas.openxmlformats.org/drawingml/2006/wordprocessingDrawing" xmlns:w10="urn:schemas-microsoft-com:office:word" xmlns:w="http://schemas.openxmlformats.org/wordprocessingml/2006/main" xmlns:w14="http://schemas.microsoft.com/office/word/2010/wordml" xmlns:w15="http://schemas.microsoft.com/office/word/2012/wordml" xmlns:w16cex="http://schemas.microsoft.com/office/word/2018/wordml/cex" xmlns:w16cid="http://schemas.microsoft.com/office/word/2016/wordml/cid" xmlns:w16="http://schemas.microsoft.com/office/word/2018/wordml" xmlns:w16du="http://schemas.microsoft.com/office/word/2023/wordml/word16du" xmlns:w16sdtdh="http://schemas.microsoft.com/office/word/2020/wordml/sdtdatahash" xmlns:w16sdtfl="http://schemas.microsoft.com/office/word/2024/wordml/sdtformatlock" xmlns:w16se="http://schemas.microsoft.com/office/word/2015/wordml/symex" xmlns:wpg="http://schemas.microsoft.com/office/word/2010/wordprocessingGroup" xmlns:wpi="http://schemas.microsoft.com/office/word/2010/wordprocessingInk" xmlns:wne="http://schemas.microsoft.com/office/word/2006/wordml" xmlns:wps="http://schemas.microsoft.com/office/word/2010/wordprocessingShape" mc:Ignorable="w14 w15 w16se w16cid w16 w16cex w16sdtdh w16sdtfl w16du wp14">
   <w:tbl>
     <w:tblPr>
       <w:tblStyle w:val="TableGrid"/>
       <w:tblW w:w="5000" w:type="pct"/>
       <w:tblCellSpacing w:w="11" w:type="dxa"/>
       <w:tblBorders>
-        <w:top w:val="none" w:color="auto" w:sz="0" w:space="0"/>
-        <w:left w:val="none" w:color="auto" w:sz="0" w:space="0"/>
-        <w:bottom w:val="none" w:color="auto" w:sz="0" w:space="0"/>
-        <w:right w:val="none" w:color="auto" w:sz="0" w:space="0"/>
-        <w:insideH w:val="none" w:color="auto" w:sz="0" w:space="0"/>
-        <w:insideV w:val="none" w:color="auto" w:sz="0" w:space="0"/>
+        <w:top w:val="none" w:sz="0" w:space="0" w:color="auto"/>
+        <w:left w:val="none" w:sz="0" w:space="0" w:color="auto"/>
+        <w:bottom w:val="none" w:sz="0" w:space="0" w:color="auto"/>
+        <w:right w:val="none" w:sz="0" w:space="0" w:color="auto"/>
+        <w:insideH w:val="none" w:sz="0" w:space="0" w:color="auto"/>
+        <w:insideV w:val="none" w:sz="0" w:space="0" w:color="auto"/>
       </w:tblBorders>
       <w:tblCellMar>
         <w:left w:w="0" w:type="dxa"/>
@@ -2716,12 +2719,12 @@
             <w:tblStyle w:val="TableGrid"/>
             <w:tblW w:w="5000" w:type="pct"/>
             <w:tblBorders>
-              <w:top w:val="none" w:color="auto" w:sz="0" w:space="0"/>
-              <w:left w:val="none" w:color="auto" w:sz="0" w:space="0"/>
-              <w:bottom w:val="none" w:color="auto" w:sz="0" w:space="0"/>
-              <w:right w:val="none" w:color="auto" w:sz="0" w:space="0"/>
-              <w:insideH w:val="none" w:color="auto" w:sz="0" w:space="0"/>
-              <w:insideV w:val="none" w:color="auto" w:sz="0" w:space="0"/>
+              <w:top w:val="none" w:sz="0" w:space="0" w:color="auto"/>
+              <w:left w:val="none" w:sz="0" w:space="0" w:color="auto"/>
+              <w:bottom w:val="none" w:sz="0" w:space="0" w:color="auto"/>
+              <w:right w:val="none" w:sz="0" w:space="0" w:color="auto"/>
+              <w:insideH w:val="none" w:sz="0" w:space="0" w:color="auto"/>
+              <w:insideV w:val="none" w:sz="0" w:space="0" w:color="auto"/>
             </w:tblBorders>
             <w:tblCellMar>
               <w:left w:w="0" w:type="dxa"/>
@@ -2774,18 +2777,18 @@
 </file>
 
 <file path=word/footer2.xml><?xml version="1.0" encoding="utf-8"?>
-<w:ftr xmlns:wpc="http://schemas.microsoft.com/office/word/2010/wordprocessingCanvas" xmlns:cx="http://schemas.microsoft.com/office/drawing/2014/chartex" xmlns:cx1="http://schemas.microsoft.com/office/drawing/2015/9/8/chartex" xmlns:cx2="http://schemas.microsoft.com/office/drawing/2015/10/21/chartex" xmlns:cx3="http://schemas.microsoft.com/office/drawing/2016/5/9/chartex" xmlns:cx4="http://schemas.microsoft.com/office/drawing/2016/5/10/chartex" xmlns:cx5="http://schemas.microsoft.com/office/drawing/2016/5/11/chartex" xmlns:cx6="http://schemas.microsoft.com/office/drawing/2016/5/12/chartex" xmlns:cx7="http://schemas.microsoft.com/office/drawing/2016/5/13/chartex" xmlns:cx8="http://schemas.microsoft.com/office/drawing/2016/5/14/chartex" xmlns:mc="http://schemas.openxmlformats.org/markup-compatibility/2006" xmlns:aink="http://schemas.microsoft.com/office/drawing/2016/ink" xmlns:am3d="http://schemas.microsoft.com/office/drawing/2017/model3d" xmlns:o="urn:schemas-microsoft-com:office:office" xmlns:oel="http://schemas.microsoft.com/office/2019/extlst" xmlns:r="http://schemas.openxmlformats.org/officeDocument/2006/relationships" xmlns:m="http://schemas.openxmlformats.org/officeDocument/2006/math" xmlns:v="urn:schemas-microsoft-com:vml" xmlns:wp14="http://schemas.microsoft.com/office/word/2010/wordprocessingDrawing" xmlns:wp="http://schemas.openxmlformats.org/drawingml/2006/wordprocessingDrawing" xmlns:w10="urn:schemas-microsoft-com:office:word" xmlns:w="http://schemas.openxmlformats.org/wordprocessingml/2006/main" xmlns:w14="http://schemas.microsoft.com/office/word/2010/wordml" xmlns:w15="http://schemas.microsoft.com/office/word/2012/wordml" xmlns:w16cex="http://schemas.microsoft.com/office/word/2018/wordml/cex" xmlns:w16cid="http://schemas.microsoft.com/office/word/2016/wordml/cid" xmlns:w16="http://schemas.microsoft.com/office/word/2018/wordml" xmlns:w16sdtdh="http://schemas.microsoft.com/office/word/2020/wordml/sdtdatahash" xmlns:w16se="http://schemas.microsoft.com/office/word/2015/wordml/symex" xmlns:wpg="http://schemas.microsoft.com/office/word/2010/wordprocessingGroup" xmlns:wpi="http://schemas.microsoft.com/office/word/2010/wordprocessingInk" xmlns:wne="http://schemas.microsoft.com/office/word/2006/wordml" xmlns:wps="http://schemas.microsoft.com/office/word/2010/wordprocessingShape" mc:Ignorable="w14 w15 w16se w16cid w16 w16cex w16sdtdh wp14">
+<w:ftr xmlns:wpc="http://schemas.microsoft.com/office/word/2010/wordprocessingCanvas" xmlns:cx="http://schemas.microsoft.com/office/drawing/2014/chartex" xmlns:cx1="http://schemas.microsoft.com/office/drawing/2015/9/8/chartex" xmlns:cx2="http://schemas.microsoft.com/office/drawing/2015/10/21/chartex" xmlns:cx3="http://schemas.microsoft.com/office/drawing/2016/5/9/chartex" xmlns:cx4="http://schemas.microsoft.com/office/drawing/2016/5/10/chartex" xmlns:cx5="http://schemas.microsoft.com/office/drawing/2016/5/11/chartex" xmlns:cx6="http://schemas.microsoft.com/office/drawing/2016/5/12/chartex" xmlns:cx7="http://schemas.microsoft.com/office/drawing/2016/5/13/chartex" xmlns:cx8="http://schemas.microsoft.com/office/drawing/2016/5/14/chartex" xmlns:mc="http://schemas.openxmlformats.org/markup-compatibility/2006" xmlns:aink="http://schemas.microsoft.com/office/drawing/2016/ink" xmlns:am3d="http://schemas.microsoft.com/office/drawing/2017/model3d" xmlns:o="urn:schemas-microsoft-com:office:office" xmlns:oel="http://schemas.microsoft.com/office/2019/extlst" xmlns:r="http://schemas.openxmlformats.org/officeDocument/2006/relationships" xmlns:m="http://schemas.openxmlformats.org/officeDocument/2006/math" xmlns:v="urn:schemas-microsoft-com:vml" xmlns:wp14="http://schemas.microsoft.com/office/word/2010/wordprocessingDrawing" xmlns:wp="http://schemas.openxmlformats.org/drawingml/2006/wordprocessingDrawing" xmlns:w10="urn:schemas-microsoft-com:office:word" xmlns:w="http://schemas.openxmlformats.org/wordprocessingml/2006/main" xmlns:w14="http://schemas.microsoft.com/office/word/2010/wordml" xmlns:w15="http://schemas.microsoft.com/office/word/2012/wordml" xmlns:w16cex="http://schemas.microsoft.com/office/word/2018/wordml/cex" xmlns:w16cid="http://schemas.microsoft.com/office/word/2016/wordml/cid" xmlns:w16="http://schemas.microsoft.com/office/word/2018/wordml" xmlns:w16du="http://schemas.microsoft.com/office/word/2023/wordml/word16du" xmlns:w16sdtdh="http://schemas.microsoft.com/office/word/2020/wordml/sdtdatahash" xmlns:w16sdtfl="http://schemas.microsoft.com/office/word/2024/wordml/sdtformatlock" xmlns:w16se="http://schemas.microsoft.com/office/word/2015/wordml/symex" xmlns:wpg="http://schemas.microsoft.com/office/word/2010/wordprocessingGroup" xmlns:wpi="http://schemas.microsoft.com/office/word/2010/wordprocessingInk" xmlns:wne="http://schemas.microsoft.com/office/word/2006/wordml" xmlns:wps="http://schemas.microsoft.com/office/word/2010/wordprocessingShape" mc:Ignorable="w14 w15 w16se w16cid w16 w16cex w16sdtdh w16sdtfl w16du wp14">
   <w:tbl>
     <w:tblPr>
       <w:tblStyle w:val="TableGrid"/>
       <w:tblW w:w="0" w:type="auto"/>
       <w:tblBorders>
-        <w:top w:val="none" w:color="auto" w:sz="0" w:space="0"/>
-        <w:left w:val="none" w:color="auto" w:sz="0" w:space="0"/>
-        <w:bottom w:val="none" w:color="auto" w:sz="0" w:space="0"/>
-        <w:right w:val="none" w:color="auto" w:sz="0" w:space="0"/>
-        <w:insideH w:val="none" w:color="auto" w:sz="0" w:space="0"/>
-        <w:insideV w:val="none" w:color="auto" w:sz="0" w:space="0"/>
+        <w:top w:val="none" w:sz="0" w:space="0" w:color="auto"/>
+        <w:left w:val="none" w:sz="0" w:space="0" w:color="auto"/>
+        <w:bottom w:val="none" w:sz="0" w:space="0" w:color="auto"/>
+        <w:right w:val="none" w:sz="0" w:space="0" w:color="auto"/>
+        <w:insideH w:val="none" w:sz="0" w:space="0" w:color="auto"/>
+        <w:insideV w:val="none" w:sz="0" w:space="0" w:color="auto"/>
       </w:tblBorders>
       <w:tblLayout w:type="fixed"/>
       <w:tblLook w:val="04A0" w:firstRow="1" w:lastRow="0" w:firstColumn="1" w:lastColumn="0" w:noHBand="0" w:noVBand="1"/>
@@ -2992,7 +2995,7 @@
 </file>
 
 <file path=word/footnotes.xml><?xml version="1.0" encoding="utf-8"?>
-<w:footnotes xmlns:wpc="http://schemas.microsoft.com/office/word/2010/wordprocessingCanvas" xmlns:cx="http://schemas.microsoft.com/office/drawing/2014/chartex" xmlns:cx1="http://schemas.microsoft.com/office/drawing/2015/9/8/chartex" xmlns:cx2="http://schemas.microsoft.com/office/drawing/2015/10/21/chartex" xmlns:cx3="http://schemas.microsoft.com/office/drawing/2016/5/9/chartex" xmlns:cx4="http://schemas.microsoft.com/office/drawing/2016/5/10/chartex" xmlns:cx5="http://schemas.microsoft.com/office/drawing/2016/5/11/chartex" xmlns:cx6="http://schemas.microsoft.com/office/drawing/2016/5/12/chartex" xmlns:cx7="http://schemas.microsoft.com/office/drawing/2016/5/13/chartex" xmlns:cx8="http://schemas.microsoft.com/office/drawing/2016/5/14/chartex" xmlns:mc="http://schemas.openxmlformats.org/markup-compatibility/2006" xmlns:aink="http://schemas.microsoft.com/office/drawing/2016/ink" xmlns:am3d="http://schemas.microsoft.com/office/drawing/2017/model3d" xmlns:o="urn:schemas-microsoft-com:office:office" xmlns:oel="http://schemas.microsoft.com/office/2019/extlst" xmlns:r="http://schemas.openxmlformats.org/officeDocument/2006/relationships" xmlns:m="http://schemas.openxmlformats.org/officeDocument/2006/math" xmlns:v="urn:schemas-microsoft-com:vml" xmlns:wp14="http://schemas.microsoft.com/office/word/2010/wordprocessingDrawing" xmlns:wp="http://schemas.openxmlformats.org/drawingml/2006/wordprocessingDrawing" xmlns:w10="urn:schemas-microsoft-com:office:word" xmlns:w="http://schemas.openxmlformats.org/wordprocessingml/2006/main" xmlns:w14="http://schemas.microsoft.com/office/word/2010/wordml" xmlns:w15="http://schemas.microsoft.com/office/word/2012/wordml" xmlns:w16cex="http://schemas.microsoft.com/office/word/2018/wordml/cex" xmlns:w16cid="http://schemas.microsoft.com/office/word/2016/wordml/cid" xmlns:w16="http://schemas.microsoft.com/office/word/2018/wordml" xmlns:w16sdtdh="http://schemas.microsoft.com/office/word/2020/wordml/sdtdatahash" xmlns:w16se="http://schemas.microsoft.com/office/word/2015/wordml/symex" xmlns:wpg="http://schemas.microsoft.com/office/word/2010/wordprocessingGroup" xmlns:wpi="http://schemas.microsoft.com/office/word/2010/wordprocessingInk" xmlns:wne="http://schemas.microsoft.com/office/word/2006/wordml" xmlns:wps="http://schemas.microsoft.com/office/word/2010/wordprocessingShape" mc:Ignorable="w14 w15 w16se w16cid w16 w16cex w16sdtdh wp14">
+<w:footnotes xmlns:wpc="http://schemas.microsoft.com/office/word/2010/wordprocessingCanvas" xmlns:cx="http://schemas.microsoft.com/office/drawing/2014/chartex" xmlns:cx1="http://schemas.microsoft.com/office/drawing/2015/9/8/chartex" xmlns:cx2="http://schemas.microsoft.com/office/drawing/2015/10/21/chartex" xmlns:cx3="http://schemas.microsoft.com/office/drawing/2016/5/9/chartex" xmlns:cx4="http://schemas.microsoft.com/office/drawing/2016/5/10/chartex" xmlns:cx5="http://schemas.microsoft.com/office/drawing/2016/5/11/chartex" xmlns:cx6="http://schemas.microsoft.com/office/drawing/2016/5/12/chartex" xmlns:cx7="http://schemas.microsoft.com/office/drawing/2016/5/13/chartex" xmlns:cx8="http://schemas.microsoft.com/office/drawing/2016/5/14/chartex" xmlns:mc="http://schemas.openxmlformats.org/markup-compatibility/2006" xmlns:aink="http://schemas.microsoft.com/office/drawing/2016/ink" xmlns:am3d="http://schemas.microsoft.com/office/drawing/2017/model3d" xmlns:o="urn:schemas-microsoft-com:office:office" xmlns:oel="http://schemas.microsoft.com/office/2019/extlst" xmlns:r="http://schemas.openxmlformats.org/officeDocument/2006/relationships" xmlns:m="http://schemas.openxmlformats.org/officeDocument/2006/math" xmlns:v="urn:schemas-microsoft-com:vml" xmlns:wp14="http://schemas.microsoft.com/office/word/2010/wordprocessingDrawing" xmlns:wp="http://schemas.openxmlformats.org/drawingml/2006/wordprocessingDrawing" xmlns:w10="urn:schemas-microsoft-com:office:word" xmlns:w="http://schemas.openxmlformats.org/wordprocessingml/2006/main" xmlns:w14="http://schemas.microsoft.com/office/word/2010/wordml" xmlns:w15="http://schemas.microsoft.com/office/word/2012/wordml" xmlns:w16cex="http://schemas.microsoft.com/office/word/2018/wordml/cex" xmlns:w16cid="http://schemas.microsoft.com/office/word/2016/wordml/cid" xmlns:w16="http://schemas.microsoft.com/office/word/2018/wordml" xmlns:w16du="http://schemas.microsoft.com/office/word/2023/wordml/word16du" xmlns:w16sdtdh="http://schemas.microsoft.com/office/word/2020/wordml/sdtdatahash" xmlns:w16sdtfl="http://schemas.microsoft.com/office/word/2024/wordml/sdtformatlock" xmlns:w16se="http://schemas.microsoft.com/office/word/2015/wordml/symex" xmlns:wpg="http://schemas.microsoft.com/office/word/2010/wordprocessingGroup" xmlns:wpi="http://schemas.microsoft.com/office/word/2010/wordprocessingInk" xmlns:wne="http://schemas.microsoft.com/office/word/2006/wordml" xmlns:wps="http://schemas.microsoft.com/office/word/2010/wordprocessingShape" mc:Ignorable="w14 w15 w16se w16cid w16 w16cex w16sdtdh w16sdtfl w16du wp14">
   <w:footnote w:type="separator" w:id="-1">
     <w:p>
       <w:pPr>
@@ -3017,18 +3020,18 @@
 </file>
 
 <file path=word/header1.xml><?xml version="1.0" encoding="utf-8"?>
-<w:hdr xmlns:wpc="http://schemas.microsoft.com/office/word/2010/wordprocessingCanvas" xmlns:cx="http://schemas.microsoft.com/office/drawing/2014/chartex" xmlns:cx1="http://schemas.microsoft.com/office/drawing/2015/9/8/chartex" xmlns:cx2="http://schemas.microsoft.com/office/drawing/2015/10/21/chartex" xmlns:cx3="http://schemas.microsoft.com/office/drawing/2016/5/9/chartex" xmlns:cx4="http://schemas.microsoft.com/office/drawing/2016/5/10/chartex" xmlns:cx5="http://schemas.microsoft.com/office/drawing/2016/5/11/chartex" xmlns:cx6="http://schemas.microsoft.com/office/drawing/2016/5/12/chartex" xmlns:cx7="http://schemas.microsoft.com/office/drawing/2016/5/13/chartex" xmlns:cx8="http://schemas.microsoft.com/office/drawing/2016/5/14/chartex" xmlns:mc="http://schemas.openxmlformats.org/markup-compatibility/2006" xmlns:aink="http://schemas.microsoft.com/office/drawing/2016/ink" xmlns:am3d="http://schemas.microsoft.com/office/drawing/2017/model3d" xmlns:o="urn:schemas-microsoft-com:office:office" xmlns:oel="http://schemas.microsoft.com/office/2019/extlst" xmlns:r="http://schemas.openxmlformats.org/officeDocument/2006/relationships" xmlns:m="http://schemas.openxmlformats.org/officeDocument/2006/math" xmlns:v="urn:schemas-microsoft-com:vml" xmlns:wp14="http://schemas.microsoft.com/office/word/2010/wordprocessingDrawing" xmlns:wp="http://schemas.openxmlformats.org/drawingml/2006/wordprocessingDrawing" xmlns:w10="urn:schemas-microsoft-com:office:word" xmlns:w="http://schemas.openxmlformats.org/wordprocessingml/2006/main" xmlns:w14="http://schemas.microsoft.com/office/word/2010/wordml" xmlns:w15="http://schemas.microsoft.com/office/word/2012/wordml" xmlns:w16cex="http://schemas.microsoft.com/office/word/2018/wordml/cex" xmlns:w16cid="http://schemas.microsoft.com/office/word/2016/wordml/cid" xmlns:w16="http://schemas.microsoft.com/office/word/2018/wordml" xmlns:w16sdtdh="http://schemas.microsoft.com/office/word/2020/wordml/sdtdatahash" xmlns:w16se="http://schemas.microsoft.com/office/word/2015/wordml/symex" xmlns:wpg="http://schemas.microsoft.com/office/word/2010/wordprocessingGroup" xmlns:wpi="http://schemas.microsoft.com/office/word/2010/wordprocessingInk" xmlns:wne="http://schemas.microsoft.com/office/word/2006/wordml" xmlns:wps="http://schemas.microsoft.com/office/word/2010/wordprocessingShape" mc:Ignorable="w14 w15 w16se w16cid w16 w16cex w16sdtdh wp14">
+<w:hdr xmlns:wpc="http://schemas.microsoft.com/office/word/2010/wordprocessingCanvas" xmlns:cx="http://schemas.microsoft.com/office/drawing/2014/chartex" xmlns:cx1="http://schemas.microsoft.com/office/drawing/2015/9/8/chartex" xmlns:cx2="http://schemas.microsoft.com/office/drawing/2015/10/21/chartex" xmlns:cx3="http://schemas.microsoft.com/office/drawing/2016/5/9/chartex" xmlns:cx4="http://schemas.microsoft.com/office/drawing/2016/5/10/chartex" xmlns:cx5="http://schemas.microsoft.com/office/drawing/2016/5/11/chartex" xmlns:cx6="http://schemas.microsoft.com/office/drawing/2016/5/12/chartex" xmlns:cx7="http://schemas.microsoft.com/office/drawing/2016/5/13/chartex" xmlns:cx8="http://schemas.microsoft.com/office/drawing/2016/5/14/chartex" xmlns:mc="http://schemas.openxmlformats.org/markup-compatibility/2006" xmlns:aink="http://schemas.microsoft.com/office/drawing/2016/ink" xmlns:am3d="http://schemas.microsoft.com/office/drawing/2017/model3d" xmlns:o="urn:schemas-microsoft-com:office:office" xmlns:oel="http://schemas.microsoft.com/office/2019/extlst" xmlns:r="http://schemas.openxmlformats.org/officeDocument/2006/relationships" xmlns:m="http://schemas.openxmlformats.org/officeDocument/2006/math" xmlns:v="urn:schemas-microsoft-com:vml" xmlns:wp14="http://schemas.microsoft.com/office/word/2010/wordprocessingDrawing" xmlns:wp="http://schemas.openxmlformats.org/drawingml/2006/wordprocessingDrawing" xmlns:w10="urn:schemas-microsoft-com:office:word" xmlns:w="http://schemas.openxmlformats.org/wordprocessingml/2006/main" xmlns:w14="http://schemas.microsoft.com/office/word/2010/wordml" xmlns:w15="http://schemas.microsoft.com/office/word/2012/wordml" xmlns:w16cex="http://schemas.microsoft.com/office/word/2018/wordml/cex" xmlns:w16cid="http://schemas.microsoft.com/office/word/2016/wordml/cid" xmlns:w16="http://schemas.microsoft.com/office/word/2018/wordml" xmlns:w16du="http://schemas.microsoft.com/office/word/2023/wordml/word16du" xmlns:w16sdtdh="http://schemas.microsoft.com/office/word/2020/wordml/sdtdatahash" xmlns:w16sdtfl="http://schemas.microsoft.com/office/word/2024/wordml/sdtformatlock" xmlns:w16se="http://schemas.microsoft.com/office/word/2015/wordml/symex" xmlns:wpg="http://schemas.microsoft.com/office/word/2010/wordprocessingGroup" xmlns:wpi="http://schemas.microsoft.com/office/word/2010/wordprocessingInk" xmlns:wne="http://schemas.microsoft.com/office/word/2006/wordml" xmlns:wps="http://schemas.microsoft.com/office/word/2010/wordprocessingShape" mc:Ignorable="w14 w15 w16se w16cid w16 w16cex w16sdtdh w16sdtfl w16du wp14">
   <w:tbl>
     <w:tblPr>
       <w:tblStyle w:val="TableGrid"/>
       <w:tblW w:w="5000" w:type="pct"/>
       <w:tblBorders>
-        <w:top w:val="none" w:color="auto" w:sz="0" w:space="0"/>
-        <w:left w:val="none" w:color="auto" w:sz="0" w:space="0"/>
-        <w:bottom w:val="none" w:color="auto" w:sz="0" w:space="0"/>
-        <w:right w:val="none" w:color="auto" w:sz="0" w:space="0"/>
-        <w:insideH w:val="none" w:color="auto" w:sz="0" w:space="0"/>
-        <w:insideV w:val="none" w:color="auto" w:sz="0" w:space="0"/>
+        <w:top w:val="none" w:sz="0" w:space="0" w:color="auto"/>
+        <w:left w:val="none" w:sz="0" w:space="0" w:color="auto"/>
+        <w:bottom w:val="none" w:sz="0" w:space="0" w:color="auto"/>
+        <w:right w:val="none" w:sz="0" w:space="0" w:color="auto"/>
+        <w:insideH w:val="none" w:sz="0" w:space="0" w:color="auto"/>
+        <w:insideV w:val="none" w:sz="0" w:space="0" w:color="auto"/>
       </w:tblBorders>
       <w:tblCellMar>
         <w:left w:w="0" w:type="dxa"/>
@@ -3297,18 +3300,18 @@
 </file>
 
 <file path=word/header2.xml><?xml version="1.0" encoding="utf-8"?>
-<w:hdr xmlns:a="http://schemas.openxmlformats.org/drawingml/2006/main" xmlns:pic="http://schemas.openxmlformats.org/drawingml/2006/picture" xmlns:wpc="http://schemas.microsoft.com/office/word/2010/wordprocessingCanvas" xmlns:cx="http://schemas.microsoft.com/office/drawing/2014/chartex" xmlns:cx1="http://schemas.microsoft.com/office/drawing/2015/9/8/chartex" xmlns:cx2="http://schemas.microsoft.com/office/drawing/2015/10/21/chartex" xmlns:cx3="http://schemas.microsoft.com/office/drawing/2016/5/9/chartex" xmlns:cx4="http://schemas.microsoft.com/office/drawing/2016/5/10/chartex" xmlns:cx5="http://schemas.microsoft.com/office/drawing/2016/5/11/chartex" xmlns:cx6="http://schemas.microsoft.com/office/drawing/2016/5/12/chartex" xmlns:cx7="http://schemas.microsoft.com/office/drawing/2016/5/13/chartex" xmlns:cx8="http://schemas.microsoft.com/office/drawing/2016/5/14/chartex" xmlns:mc="http://schemas.openxmlformats.org/markup-compatibility/2006" xmlns:aink="http://schemas.microsoft.com/office/drawing/2016/ink" xmlns:am3d="http://schemas.microsoft.com/office/drawing/2017/model3d" xmlns:o="urn:schemas-microsoft-com:office:office" xmlns:oel="http://schemas.microsoft.com/office/2019/extlst" xmlns:r="http://schemas.openxmlformats.org/officeDocument/2006/relationships" xmlns:m="http://schemas.openxmlformats.org/officeDocument/2006/math" xmlns:v="urn:schemas-microsoft-com:vml" xmlns:wp14="http://schemas.microsoft.com/office/word/2010/wordprocessingDrawing" xmlns:wp="http://schemas.openxmlformats.org/drawingml/2006/wordprocessingDrawing" xmlns:w10="urn:schemas-microsoft-com:office:word" xmlns:w="http://schemas.openxmlformats.org/wordprocessingml/2006/main" xmlns:w14="http://schemas.microsoft.com/office/word/2010/wordml" xmlns:w15="http://schemas.microsoft.com/office/word/2012/wordml" xmlns:w16cex="http://schemas.microsoft.com/office/word/2018/wordml/cex" xmlns:w16cid="http://schemas.microsoft.com/office/word/2016/wordml/cid" xmlns:w16="http://schemas.microsoft.com/office/word/2018/wordml" xmlns:w16sdtdh="http://schemas.microsoft.com/office/word/2020/wordml/sdtdatahash" xmlns:w16se="http://schemas.microsoft.com/office/word/2015/wordml/symex" xmlns:wpg="http://schemas.microsoft.com/office/word/2010/wordprocessingGroup" xmlns:wpi="http://schemas.microsoft.com/office/word/2010/wordprocessingInk" xmlns:wne="http://schemas.microsoft.com/office/word/2006/wordml" xmlns:wps="http://schemas.microsoft.com/office/word/2010/wordprocessingShape" mc:Ignorable="w14 w15 w16se w16cid w16 w16cex w16sdtdh wp14">
+<w:hdr xmlns:wpc="http://schemas.microsoft.com/office/word/2010/wordprocessingCanvas" xmlns:cx="http://schemas.microsoft.com/office/drawing/2014/chartex" xmlns:cx1="http://schemas.microsoft.com/office/drawing/2015/9/8/chartex" xmlns:cx2="http://schemas.microsoft.com/office/drawing/2015/10/21/chartex" xmlns:cx3="http://schemas.microsoft.com/office/drawing/2016/5/9/chartex" xmlns:cx4="http://schemas.microsoft.com/office/drawing/2016/5/10/chartex" xmlns:cx5="http://schemas.microsoft.com/office/drawing/2016/5/11/chartex" xmlns:cx6="http://schemas.microsoft.com/office/drawing/2016/5/12/chartex" xmlns:cx7="http://schemas.microsoft.com/office/drawing/2016/5/13/chartex" xmlns:cx8="http://schemas.microsoft.com/office/drawing/2016/5/14/chartex" xmlns:mc="http://schemas.openxmlformats.org/markup-compatibility/2006" xmlns:aink="http://schemas.microsoft.com/office/drawing/2016/ink" xmlns:am3d="http://schemas.microsoft.com/office/drawing/2017/model3d" xmlns:o="urn:schemas-microsoft-com:office:office" xmlns:oel="http://schemas.microsoft.com/office/2019/extlst" xmlns:r="http://schemas.openxmlformats.org/officeDocument/2006/relationships" xmlns:m="http://schemas.openxmlformats.org/officeDocument/2006/math" xmlns:v="urn:schemas-microsoft-com:vml" xmlns:wp14="http://schemas.microsoft.com/office/word/2010/wordprocessingDrawing" xmlns:wp="http://schemas.openxmlformats.org/drawingml/2006/wordprocessingDrawing" xmlns:w10="urn:schemas-microsoft-com:office:word" xmlns:w="http://schemas.openxmlformats.org/wordprocessingml/2006/main" xmlns:w14="http://schemas.microsoft.com/office/word/2010/wordml" xmlns:w15="http://schemas.microsoft.com/office/word/2012/wordml" xmlns:w16cex="http://schemas.microsoft.com/office/word/2018/wordml/cex" xmlns:w16cid="http://schemas.microsoft.com/office/word/2016/wordml/cid" xmlns:w16="http://schemas.microsoft.com/office/word/2018/wordml" xmlns:w16du="http://schemas.microsoft.com/office/word/2023/wordml/word16du" xmlns:w16sdtdh="http://schemas.microsoft.com/office/word/2020/wordml/sdtdatahash" xmlns:w16sdtfl="http://schemas.microsoft.com/office/word/2024/wordml/sdtformatlock" xmlns:w16se="http://schemas.microsoft.com/office/word/2015/wordml/symex" xmlns:wpg="http://schemas.microsoft.com/office/word/2010/wordprocessingGroup" xmlns:wpi="http://schemas.microsoft.com/office/word/2010/wordprocessingInk" xmlns:wne="http://schemas.microsoft.com/office/word/2006/wordml" xmlns:wps="http://schemas.microsoft.com/office/word/2010/wordprocessingShape" mc:Ignorable="w14 w15 w16se w16cid w16 w16cex w16sdtdh w16sdtfl w16du wp14">
   <w:tbl>
     <w:tblPr>
       <w:tblStyle w:val="TableGrid"/>
       <w:tblW w:w="5000" w:type="pct"/>
       <w:tblBorders>
-        <w:top w:val="none" w:color="auto" w:sz="0" w:space="0"/>
-        <w:left w:val="none" w:color="auto" w:sz="0" w:space="0"/>
-        <w:bottom w:val="none" w:color="auto" w:sz="0" w:space="0"/>
-        <w:right w:val="none" w:color="auto" w:sz="0" w:space="0"/>
-        <w:insideH w:val="none" w:color="auto" w:sz="0" w:space="0"/>
-        <w:insideV w:val="none" w:color="auto" w:sz="0" w:space="0"/>
+        <w:top w:val="none" w:sz="0" w:space="0" w:color="auto"/>
+        <w:left w:val="none" w:sz="0" w:space="0" w:color="auto"/>
+        <w:bottom w:val="none" w:sz="0" w:space="0" w:color="auto"/>
+        <w:right w:val="none" w:sz="0" w:space="0" w:color="auto"/>
+        <w:insideH w:val="none" w:sz="0" w:space="0" w:color="auto"/>
+        <w:insideV w:val="none" w:sz="0" w:space="0" w:color="auto"/>
       </w:tblBorders>
       <w:tblCellMar>
         <w:left w:w="0" w:type="dxa"/>
@@ -3564,7 +3567,7 @@
 </file>
 
 <file path=word/styles.xml><?xml version="1.0" encoding="utf-8"?>
-<w:styles xmlns:mc="http://schemas.openxmlformats.org/markup-compatibility/2006" xmlns:r="http://schemas.openxmlformats.org/officeDocument/2006/relationships" xmlns:w="http://schemas.openxmlformats.org/wordprocessingml/2006/main" xmlns:w14="http://schemas.microsoft.com/office/word/2010/wordml" xmlns:w15="http://schemas.microsoft.com/office/word/2012/wordml" xmlns:w16cex="http://schemas.microsoft.com/office/word/2018/wordml/cex" xmlns:w16cid="http://schemas.microsoft.com/office/word/2016/wordml/cid" xmlns:w16="http://schemas.microsoft.com/office/word/2018/wordml" xmlns:w16sdtdh="http://schemas.microsoft.com/office/word/2020/wordml/sdtdatahash" xmlns:w16se="http://schemas.microsoft.com/office/word/2015/wordml/symex" mc:Ignorable="w14 w15 w16se w16cid w16 w16cex w16sdtdh">
+<w:styles xmlns:mc="http://schemas.openxmlformats.org/markup-compatibility/2006" xmlns:r="http://schemas.openxmlformats.org/officeDocument/2006/relationships" xmlns:w="http://schemas.openxmlformats.org/wordprocessingml/2006/main" xmlns:w14="http://schemas.microsoft.com/office/word/2010/wordml" xmlns:w15="http://schemas.microsoft.com/office/word/2012/wordml" xmlns:w16cex="http://schemas.microsoft.com/office/word/2018/wordml/cex" xmlns:w16cid="http://schemas.microsoft.com/office/word/2016/wordml/cid" xmlns:w16="http://schemas.microsoft.com/office/word/2018/wordml" xmlns:w16du="http://schemas.microsoft.com/office/word/2023/wordml/word16du" xmlns:w16sdtdh="http://schemas.microsoft.com/office/word/2020/wordml/sdtdatahash" xmlns:w16sdtfl="http://schemas.microsoft.com/office/word/2024/wordml/sdtformatlock" xmlns:w16se="http://schemas.microsoft.com/office/word/2015/wordml/symex" mc:Ignorable="w14 w15 w16se w16cid w16 w16cex w16sdtdh w16sdtfl w16du">
   <w:docDefaults>
     <w:rPrDefault>
       <w:rPr>
@@ -4313,7 +4316,7 @@
 </file>
 
 <file path=word/glossary/document.xml><?xml version="1.0" encoding="utf-8"?>
-<w:glossaryDocument xmlns:wpc="http://schemas.microsoft.com/office/word/2010/wordprocessingCanvas" xmlns:cx="http://schemas.microsoft.com/office/drawing/2014/chartex" xmlns:cx1="http://schemas.microsoft.com/office/drawing/2015/9/8/chartex" xmlns:cx2="http://schemas.microsoft.com/office/drawing/2015/10/21/chartex" xmlns:cx3="http://schemas.microsoft.com/office/drawing/2016/5/9/chartex" xmlns:cx4="http://schemas.microsoft.com/office/drawing/2016/5/10/chartex" xmlns:cx5="http://schemas.microsoft.com/office/drawing/2016/5/11/chartex" xmlns:cx6="http://schemas.microsoft.com/office/drawing/2016/5/12/chartex" xmlns:cx7="http://schemas.microsoft.com/office/drawing/2016/5/13/chartex" xmlns:cx8="http://schemas.microsoft.com/office/drawing/2016/5/14/chartex" xmlns:mc="http://schemas.openxmlformats.org/markup-compatibility/2006" xmlns:aink="http://schemas.microsoft.com/office/drawing/2016/ink" xmlns:am3d="http://schemas.microsoft.com/office/drawing/2017/model3d" xmlns:o="urn:schemas-microsoft-com:office:office" xmlns:oel="http://schemas.microsoft.com/office/2019/extlst" xmlns:r="http://schemas.openxmlformats.org/officeDocument/2006/relationships" xmlns:m="http://schemas.openxmlformats.org/officeDocument/2006/math" xmlns:v="urn:schemas-microsoft-com:vml" xmlns:wp14="http://schemas.microsoft.com/office/word/2010/wordprocessingDrawing" xmlns:wp="http://schemas.openxmlformats.org/drawingml/2006/wordprocessingDrawing" xmlns:w10="urn:schemas-microsoft-com:office:word" xmlns:w="http://schemas.openxmlformats.org/wordprocessingml/2006/main" xmlns:w14="http://schemas.microsoft.com/office/word/2010/wordml" xmlns:w15="http://schemas.microsoft.com/office/word/2012/wordml" xmlns:w16cex="http://schemas.microsoft.com/office/word/2018/wordml/cex" xmlns:w16cid="http://schemas.microsoft.com/office/word/2016/wordml/cid" xmlns:w16="http://schemas.microsoft.com/office/word/2018/wordml" xmlns:w16sdtdh="http://schemas.microsoft.com/office/word/2020/wordml/sdtdatahash" xmlns:w16se="http://schemas.microsoft.com/office/word/2015/wordml/symex" xmlns:wpg="http://schemas.microsoft.com/office/word/2010/wordprocessingGroup" xmlns:wpi="http://schemas.microsoft.com/office/word/2010/wordprocessingInk" xmlns:wne="http://schemas.microsoft.com/office/word/2006/wordml" xmlns:wps="http://schemas.microsoft.com/office/word/2010/wordprocessingShape" mc:Ignorable="w14 w15 w16se w16cid w16 w16cex w16sdtdh wp14">
+<w:glossaryDocument xmlns:wpc="http://schemas.microsoft.com/office/word/2010/wordprocessingCanvas" xmlns:cx="http://schemas.microsoft.com/office/drawing/2014/chartex" xmlns:cx1="http://schemas.microsoft.com/office/drawing/2015/9/8/chartex" xmlns:cx2="http://schemas.microsoft.com/office/drawing/2015/10/21/chartex" xmlns:cx3="http://schemas.microsoft.com/office/drawing/2016/5/9/chartex" xmlns:cx4="http://schemas.microsoft.com/office/drawing/2016/5/10/chartex" xmlns:cx5="http://schemas.microsoft.com/office/drawing/2016/5/11/chartex" xmlns:cx6="http://schemas.microsoft.com/office/drawing/2016/5/12/chartex" xmlns:cx7="http://schemas.microsoft.com/office/drawing/2016/5/13/chartex" xmlns:cx8="http://schemas.microsoft.com/office/drawing/2016/5/14/chartex" xmlns:mc="http://schemas.openxmlformats.org/markup-compatibility/2006" xmlns:aink="http://schemas.microsoft.com/office/drawing/2016/ink" xmlns:am3d="http://schemas.microsoft.com/office/drawing/2017/model3d" xmlns:o="urn:schemas-microsoft-com:office:office" xmlns:oel="http://schemas.microsoft.com/office/2019/extlst" xmlns:r="http://schemas.openxmlformats.org/officeDocument/2006/relationships" xmlns:m="http://schemas.openxmlformats.org/officeDocument/2006/math" xmlns:v="urn:schemas-microsoft-com:vml" xmlns:wp14="http://schemas.microsoft.com/office/word/2010/wordprocessingDrawing" xmlns:wp="http://schemas.openxmlformats.org/drawingml/2006/wordprocessingDrawing" xmlns:w10="urn:schemas-microsoft-com:office:word" xmlns:w="http://schemas.openxmlformats.org/wordprocessingml/2006/main" xmlns:w14="http://schemas.microsoft.com/office/word/2010/wordml" xmlns:w15="http://schemas.microsoft.com/office/word/2012/wordml" xmlns:w16cex="http://schemas.microsoft.com/office/word/2018/wordml/cex" xmlns:w16cid="http://schemas.microsoft.com/office/word/2016/wordml/cid" xmlns:w16="http://schemas.microsoft.com/office/word/2018/wordml" xmlns:w16du="http://schemas.microsoft.com/office/word/2023/wordml/word16du" xmlns:w16sdtdh="http://schemas.microsoft.com/office/word/2020/wordml/sdtdatahash" xmlns:w16sdtfl="http://schemas.microsoft.com/office/word/2024/wordml/sdtformatlock" xmlns:w16se="http://schemas.microsoft.com/office/word/2015/wordml/symex" xmlns:wpg="http://schemas.microsoft.com/office/word/2010/wordprocessingGroup" xmlns:wpi="http://schemas.microsoft.com/office/word/2010/wordprocessingInk" xmlns:wne="http://schemas.microsoft.com/office/word/2006/wordml" xmlns:wps="http://schemas.microsoft.com/office/word/2010/wordprocessingShape" mc:Ignorable="w14 w15 w16se w16cid w16 w16cex w16sdtdh w16sdtfl w16du wp14">
   <w:docParts>
     <w:docPart>
       <w:docPartPr>
@@ -4746,7 +4749,7 @@
 </file>
 
 <file path=word/glossary/fontTable.xml><?xml version="1.0" encoding="utf-8"?>
-<w:fonts xmlns:mc="http://schemas.openxmlformats.org/markup-compatibility/2006" xmlns:r="http://schemas.openxmlformats.org/officeDocument/2006/relationships" xmlns:w="http://schemas.openxmlformats.org/wordprocessingml/2006/main" xmlns:w14="http://schemas.microsoft.com/office/word/2010/wordml" xmlns:w15="http://schemas.microsoft.com/office/word/2012/wordml" xmlns:w16cex="http://schemas.microsoft.com/office/word/2018/wordml/cex" xmlns:w16cid="http://schemas.microsoft.com/office/word/2016/wordml/cid" xmlns:w16="http://schemas.microsoft.com/office/word/2018/wordml" xmlns:w16sdtdh="http://schemas.microsoft.com/office/word/2020/wordml/sdtdatahash" xmlns:w16se="http://schemas.microsoft.com/office/word/2015/wordml/symex" mc:Ignorable="w14 w15 w16se w16cid w16 w16cex w16sdtdh">
+<w:fonts xmlns:mc="http://schemas.openxmlformats.org/markup-compatibility/2006" xmlns:r="http://schemas.openxmlformats.org/officeDocument/2006/relationships" xmlns:w="http://schemas.openxmlformats.org/wordprocessingml/2006/main" xmlns:w14="http://schemas.microsoft.com/office/word/2010/wordml" xmlns:w15="http://schemas.microsoft.com/office/word/2012/wordml" xmlns:w16cex="http://schemas.microsoft.com/office/word/2018/wordml/cex" xmlns:w16cid="http://schemas.microsoft.com/office/word/2016/wordml/cid" xmlns:w16="http://schemas.microsoft.com/office/word/2018/wordml" xmlns:w16du="http://schemas.microsoft.com/office/word/2023/wordml/word16du" xmlns:w16sdtdh="http://schemas.microsoft.com/office/word/2020/wordml/sdtdatahash" xmlns:w16sdtfl="http://schemas.microsoft.com/office/word/2024/wordml/sdtformatlock" xmlns:w16se="http://schemas.microsoft.com/office/word/2015/wordml/symex" mc:Ignorable="w14 w15 w16se w16cid w16 w16cex w16sdtdh w16sdtfl w16du">
   <w:font w:name="Calibri">
     <w:panose1 w:val="020F0502020204030204"/>
     <w:charset w:val="00"/>
@@ -4784,7 +4787,7 @@
 </file>
 
 <file path=word/glossary/settings.xml><?xml version="1.0" encoding="utf-8"?>
-<w:settings xmlns:mc="http://schemas.openxmlformats.org/markup-compatibility/2006" xmlns:o="urn:schemas-microsoft-com:office:office" xmlns:r="http://schemas.openxmlformats.org/officeDocument/2006/relationships" xmlns:m="http://schemas.openxmlformats.org/officeDocument/2006/math" xmlns:v="urn:schemas-microsoft-com:vml" xmlns:w10="urn:schemas-microsoft-com:office:word" xmlns:w="http://schemas.openxmlformats.org/wordprocessingml/2006/main" xmlns:w14="http://schemas.microsoft.com/office/word/2010/wordml" xmlns:w15="http://schemas.microsoft.com/office/word/2012/wordml" xmlns:w16cex="http://schemas.microsoft.com/office/word/2018/wordml/cex" xmlns:w16cid="http://schemas.microsoft.com/office/word/2016/wordml/cid" xmlns:w16="http://schemas.microsoft.com/office/word/2018/wordml" xmlns:w16sdtdh="http://schemas.microsoft.com/office/word/2020/wordml/sdtdatahash" xmlns:w16se="http://schemas.microsoft.com/office/word/2015/wordml/symex" xmlns:sl="http://schemas.openxmlformats.org/schemaLibrary/2006/main" mc:Ignorable="w14 w15 w16se w16cid w16 w16cex w16sdtdh">
+<w:settings xmlns:mc="http://schemas.openxmlformats.org/markup-compatibility/2006" xmlns:o="urn:schemas-microsoft-com:office:office" xmlns:r="http://schemas.openxmlformats.org/officeDocument/2006/relationships" xmlns:m="http://schemas.openxmlformats.org/officeDocument/2006/math" xmlns:v="urn:schemas-microsoft-com:vml" xmlns:w10="urn:schemas-microsoft-com:office:word" xmlns:w="http://schemas.openxmlformats.org/wordprocessingml/2006/main" xmlns:w14="http://schemas.microsoft.com/office/word/2010/wordml" xmlns:w15="http://schemas.microsoft.com/office/word/2012/wordml" xmlns:w16cex="http://schemas.microsoft.com/office/word/2018/wordml/cex" xmlns:w16cid="http://schemas.microsoft.com/office/word/2016/wordml/cid" xmlns:w16="http://schemas.microsoft.com/office/word/2018/wordml" xmlns:w16du="http://schemas.microsoft.com/office/word/2023/wordml/word16du" xmlns:w16sdtdh="http://schemas.microsoft.com/office/word/2020/wordml/sdtdatahash" xmlns:w16sdtfl="http://schemas.microsoft.com/office/word/2024/wordml/sdtformatlock" xmlns:w16se="http://schemas.microsoft.com/office/word/2015/wordml/symex" xmlns:sl="http://schemas.openxmlformats.org/schemaLibrary/2006/main" mc:Ignorable="w14 w15 w16se w16cid w16 w16cex w16sdtdh w16sdtfl w16du">
   <w:view w:val="normal"/>
   <w:defaultTabStop w:val="720"/>
   <w:characterSpacingControl w:val="doNotCompress"/>
@@ -4811,6 +4814,7 @@
     <w:rsid w:val="001F4967"/>
     <w:rsid w:val="0020281A"/>
     <w:rsid w:val="002221B4"/>
+    <w:rsid w:val="00227D2D"/>
     <w:rsid w:val="00277793"/>
     <w:rsid w:val="00280539"/>
     <w:rsid w:val="0029741B"/>
@@ -4857,6 +4861,7 @@
     <w:rsid w:val="00AE701E"/>
     <w:rsid w:val="00AF1763"/>
     <w:rsid w:val="00B104BA"/>
+    <w:rsid w:val="00B55A8D"/>
     <w:rsid w:val="00B66C6B"/>
     <w:rsid w:val="00B7711D"/>
     <w:rsid w:val="00B87D0B"/>
@@ -4907,7 +4912,7 @@
 </file>
 
 <file path=word/glossary/styles.xml><?xml version="1.0" encoding="utf-8"?>
-<w:styles xmlns:mc="http://schemas.openxmlformats.org/markup-compatibility/2006" xmlns:r="http://schemas.openxmlformats.org/officeDocument/2006/relationships" xmlns:w="http://schemas.openxmlformats.org/wordprocessingml/2006/main" xmlns:w14="http://schemas.microsoft.com/office/word/2010/wordml" xmlns:w15="http://schemas.microsoft.com/office/word/2012/wordml" xmlns:w16cex="http://schemas.microsoft.com/office/word/2018/wordml/cex" xmlns:w16cid="http://schemas.microsoft.com/office/word/2016/wordml/cid" xmlns:w16="http://schemas.microsoft.com/office/word/2018/wordml" xmlns:w16sdtdh="http://schemas.microsoft.com/office/word/2020/wordml/sdtdatahash" xmlns:w16se="http://schemas.microsoft.com/office/word/2015/wordml/symex" mc:Ignorable="w14 w15 w16se w16cid w16 w16cex w16sdtdh">
+<w:styles xmlns:mc="http://schemas.openxmlformats.org/markup-compatibility/2006" xmlns:r="http://schemas.openxmlformats.org/officeDocument/2006/relationships" xmlns:w="http://schemas.openxmlformats.org/wordprocessingml/2006/main" xmlns:w14="http://schemas.microsoft.com/office/word/2010/wordml" xmlns:w15="http://schemas.microsoft.com/office/word/2012/wordml" xmlns:w16cex="http://schemas.microsoft.com/office/word/2018/wordml/cex" xmlns:w16cid="http://schemas.microsoft.com/office/word/2016/wordml/cid" xmlns:w16="http://schemas.microsoft.com/office/word/2018/wordml" xmlns:w16du="http://schemas.microsoft.com/office/word/2023/wordml/word16du" xmlns:w16sdtdh="http://schemas.microsoft.com/office/word/2020/wordml/sdtdatahash" xmlns:w16sdtfl="http://schemas.microsoft.com/office/word/2024/wordml/sdtformatlock" xmlns:w16se="http://schemas.microsoft.com/office/word/2015/wordml/symex" mc:Ignorable="w14 w15 w16se w16cid w16 w16cex w16sdtdh w16sdtfl w16du">
   <w:docDefaults>
     <w:rPrDefault>
       <w:rPr>
@@ -5394,7 +5399,7 @@
 </file>
 
 <file path=word/glossary/webSettings.xml><?xml version="1.0" encoding="utf-8"?>
-<w:webSettings xmlns:mc="http://schemas.openxmlformats.org/markup-compatibility/2006" xmlns:r="http://schemas.openxmlformats.org/officeDocument/2006/relationships" xmlns:w="http://schemas.openxmlformats.org/wordprocessingml/2006/main" xmlns:w14="http://schemas.microsoft.com/office/word/2010/wordml" xmlns:w15="http://schemas.microsoft.com/office/word/2012/wordml" xmlns:w16cex="http://schemas.microsoft.com/office/word/2018/wordml/cex" xmlns:w16cid="http://schemas.microsoft.com/office/word/2016/wordml/cid" xmlns:w16="http://schemas.microsoft.com/office/word/2018/wordml" xmlns:w16sdtdh="http://schemas.microsoft.com/office/word/2020/wordml/sdtdatahash" xmlns:w16se="http://schemas.microsoft.com/office/word/2015/wordml/symex" mc:Ignorable="w14 w15 w16se w16cid w16 w16cex w16sdtdh">
+<w:webSettings xmlns:mc="http://schemas.openxmlformats.org/markup-compatibility/2006" xmlns:r="http://schemas.openxmlformats.org/officeDocument/2006/relationships" xmlns:w="http://schemas.openxmlformats.org/wordprocessingml/2006/main" xmlns:w14="http://schemas.microsoft.com/office/word/2010/wordml" xmlns:w15="http://schemas.microsoft.com/office/word/2012/wordml" xmlns:w16cex="http://schemas.microsoft.com/office/word/2018/wordml/cex" xmlns:w16cid="http://schemas.microsoft.com/office/word/2016/wordml/cid" xmlns:w16="http://schemas.microsoft.com/office/word/2018/wordml" xmlns:w16du="http://schemas.microsoft.com/office/word/2023/wordml/word16du" xmlns:w16sdtdh="http://schemas.microsoft.com/office/word/2020/wordml/sdtdatahash" xmlns:w16sdtfl="http://schemas.microsoft.com/office/word/2024/wordml/sdtformatlock" xmlns:w16se="http://schemas.microsoft.com/office/word/2015/wordml/symex" mc:Ignorable="w14 w15 w16se w16cid w16 w16cex w16sdtdh w16sdtfl w16du">
   <w:optimizeForBrowser/>
   <w:allowPNG/>
 </w:webSettings>
@@ -5661,9 +5666,11 @@
 </a:theme>
 </file>
 
-<file path=customXml/item1.xml>��< ? x m l   v e r s i o n = " 1 . 0 "   e n c o d i n g = " u t f - 1 6 " ? > - 
- < N a v W o r d R e p o r t X m l P a r t   x m l n s = " u r n : m i c r o s o f t - d y n a m i c s - n a v / r e p o r t s / S t a n d a r d _ P u r c h a s e _ O r d e r / 1 3 2 2 / " > +<file path=customXml/item1.xml><?xml version="1.0" encoding="utf-8"?>
+<b:Sources xmlns:b="http://schemas.openxmlformats.org/officeDocument/2006/bibliography" xmlns="http://schemas.openxmlformats.org/officeDocument/2006/bibliography" SelectedStyle="\APASixthEditionOfficeOnline.xsl" StyleName="APA" Version="6"/>
+</file>
+
+<file path=customXml/item2.xml>��< ? x m l   v e r s i o n = " 1 . 0 "   e n c o d i n g = " u t f - 1 6 " ? > < N a v W o r d R e p o r t X m l P a r t   x m l n s = " u r n : m i c r o s o f t - d y n a m i c s - n a v / r e p o r t s / S t a n d a r d _ P u r c h a s e _ O r d e r / 1 3 2 2 / " >   
      < B C R e p o r t I n f o r m a t i o n >   
@@ -6230,22 +6237,18 @@
  < / N a v W o r d R e p o r t X m l P a r t > 
 </file>
 
-<file path=customXml/item2.xml><?xml version="1.0" encoding="utf-8"?>
-<b:Sources xmlns:b="http://schemas.openxmlformats.org/officeDocument/2006/bibliography" xmlns="http://schemas.openxmlformats.org/officeDocument/2006/bibliography" SelectedStyle="\APASixthEditionOfficeOnline.xsl" StyleName="APA" Version="6"/>
-</file>
-
 <file path=customXml/itemProps1.xml><?xml version="1.0" encoding="utf-8"?>
-<ds:datastoreItem xmlns:ds="http://schemas.openxmlformats.org/officeDocument/2006/customXml" ds:itemID="{7C9D7B99-3F0A-4DC8-9D28-B3E523DBEA5C}">
+<ds:datastoreItem xmlns:ds="http://schemas.openxmlformats.org/officeDocument/2006/customXml" ds:itemID="{7320341C-6788-4F0C-B9EA-269F5F4EA422}">
   <ds:schemaRefs>
-    <ds:schemaRef ds:uri="urn:microsoft-dynamics-nav/reports/Standard_Purchase_Order/1322/"/>
+    <ds:schemaRef ds:uri="http://schemas.openxmlformats.org/officeDocument/2006/bibliography"/>
   </ds:schemaRefs>
 </ds:datastoreItem>
 </file>
 
 <file path=customXml/itemProps2.xml><?xml version="1.0" encoding="utf-8"?>
-<ds:datastoreItem xmlns:ds="http://schemas.openxmlformats.org/officeDocument/2006/customXml" ds:itemID="{7320341C-6788-4F0C-B9EA-269F5F4EA422}">
+<ds:datastoreItem xmlns:ds="http://schemas.openxmlformats.org/officeDocument/2006/customXml" ds:itemID="{7C9D7B99-3F0A-4DC8-9D28-B3E523DBEA5C}">
   <ds:schemaRefs>
-    <ds:schemaRef ds:uri="http://schemas.openxmlformats.org/officeDocument/2006/bibliography"/>
+    <ds:schemaRef ds:uri="urn:microsoft-dynamics-nav/reports/Standard_Purchase_Order/1322/"/>
   </ds:schemaRefs>
 </ds:datastoreItem>
 </file>

</xml_diff>